<commit_message>
docs: add evidence based Lab 4 progress tables
</commit_message>
<xml_diff>
--- a/docs/lab4/LAB4.1-Techvora.docx
+++ b/docs/lab4/LAB4.1-Techvora.docx
@@ -1145,7 +1145,6 @@
           <w:sz w:val="22"/>
           <w:szCs w:val="26"/>
         </w:rPr>
-        <w:lastRenderedPageBreak/>
         <w:t>☐</w:t>
       </w:r>
       <w:r>
@@ -1224,6 +1223,7 @@
                 <w:sz w:val="19"/>
                 <w:szCs w:val="26"/>
               </w:rPr>
+              <w:lastRenderedPageBreak/>
               <w:t>Thành viên</w:t>
             </w:r>
           </w:p>
@@ -3000,7 +3000,6 @@
           <w:sz w:val="24"/>
           <w:szCs w:val="26"/>
         </w:rPr>
-        <w:lastRenderedPageBreak/>
         <w:t>5. Công việc riêng của Sprint</w:t>
       </w:r>
     </w:p>
@@ -3095,6 +3094,7 @@
           <w:sz w:val="24"/>
           <w:szCs w:val="26"/>
         </w:rPr>
+        <w:lastRenderedPageBreak/>
         <w:t>6. Nhật ký tiến độ và minh chứng</w:t>
       </w:r>
     </w:p>
@@ -3991,6 +3991,518 @@
         </w:rPr>
         <w:t>Chi tiết: docs/lab4/sprint-1.md. Ngày bắt đầu thực tế ở chín dòng Sprint 1 cần đối chiếu lại; nhật ký trên là mốc Git/test, không phải biên bản họp.</w:t>
       </w:r>
+    </w:p>
+    <w:p>
+      <w:pPr>
+        <w:keepNext/>
+        <w:pageBreakBefore/>
+        <w:spacing w:before="200" w:line="360" w:lineRule="auto"/>
+        <w:rPr>
+          <w:rFonts w:ascii="Times New Roman" w:hAnsi="Times New Roman" w:cs="Times New Roman"/>
+          <w:b/>
+          <w:sz w:val="24"/>
+          <w:szCs w:val="26"/>
+        </w:rPr>
+      </w:pPr>
+      <w:r>
+        <w:rPr>
+          <w:rFonts w:ascii="Times New Roman" w:hAnsi="Times New Roman" w:cs="Times New Roman"/>
+          <w:b/>
+          <w:sz w:val="24"/>
+          <w:szCs w:val="26"/>
+        </w:rPr>
+        <w:t>9. Đối chiếu công việc đã làm và chưa làm</w:t>
+      </w:r>
+    </w:p>
+    <w:tbl>
+      <w:tblPr>
+        <w:tblW w:w="10700" w:type="dxa"/>
+        <w:tblBorders>
+          <w:top w:val="single" w:sz="4" w:space="0" w:color="auto"/>
+          <w:left w:val="single" w:sz="4" w:space="0" w:color="auto"/>
+          <w:bottom w:val="single" w:sz="4" w:space="0" w:color="auto"/>
+          <w:right w:val="single" w:sz="4" w:space="0" w:color="auto"/>
+          <w:insideH w:val="single" w:sz="4" w:space="0" w:color="auto"/>
+          <w:insideV w:val="single" w:sz="4" w:space="0" w:color="auto"/>
+        </w:tblBorders>
+        <w:tblLayout w:type="fixed"/>
+        <w:tblCellMar>
+          <w:top w:w="60" w:type="dxa"/>
+          <w:left w:w="80" w:type="dxa"/>
+          <w:bottom w:w="60" w:type="dxa"/>
+          <w:right w:w="80" w:type="dxa"/>
+        </w:tblCellMar>
+        <w:tblLook w:val="0000" w:firstRow="0" w:lastRow="0" w:firstColumn="0" w:lastColumn="0" w:noHBand="0" w:noVBand="0"/>
+      </w:tblPr>
+      <w:tblGrid>
+        <w:gridCol w:w="2700"/>
+        <w:gridCol w:w="4100"/>
+        <w:gridCol w:w="3900"/>
+      </w:tblGrid>
+      <w:tr>
+        <w:trPr>
+          <w:cantSplit/>
+          <w:tblHeader/>
+        </w:trPr>
+        <w:tc>
+          <w:tcPr>
+            <w:tcW w:w="2700" w:type="dxa"/>
+            <w:shd w:val="clear" w:color="auto" w:fill="DCEAF4"/>
+          </w:tcPr>
+          <w:p>
+            <w:pPr>
+              <w:spacing w:after="0" w:line="360" w:lineRule="auto"/>
+              <w:rPr>
+                <w:rFonts w:ascii="Times New Roman" w:hAnsi="Times New Roman" w:cs="Times New Roman"/>
+                <w:b/>
+                <w:sz w:val="19"/>
+                <w:szCs w:val="26"/>
+              </w:rPr>
+            </w:pPr>
+            <w:r>
+              <w:rPr>
+                <w:rFonts w:ascii="Times New Roman" w:hAnsi="Times New Roman" w:cs="Times New Roman"/>
+                <w:b/>
+                <w:sz w:val="19"/>
+                <w:szCs w:val="26"/>
+              </w:rPr>
+              <w:t>Hạng mục</w:t>
+            </w:r>
+          </w:p>
+        </w:tc>
+        <w:tc>
+          <w:tcPr>
+            <w:tcW w:w="4100" w:type="dxa"/>
+            <w:shd w:val="clear" w:color="auto" w:fill="DCEAF4"/>
+          </w:tcPr>
+          <w:p>
+            <w:pPr>
+              <w:spacing w:after="0" w:line="360" w:lineRule="auto"/>
+              <w:rPr>
+                <w:rFonts w:ascii="Times New Roman" w:hAnsi="Times New Roman" w:cs="Times New Roman"/>
+                <w:b/>
+                <w:sz w:val="19"/>
+                <w:szCs w:val="26"/>
+              </w:rPr>
+            </w:pPr>
+            <w:r>
+              <w:rPr>
+                <w:rFonts w:ascii="Times New Roman" w:hAnsi="Times New Roman" w:cs="Times New Roman"/>
+                <w:b/>
+                <w:sz w:val="19"/>
+                <w:szCs w:val="26"/>
+              </w:rPr>
+              <w:t>Đã làm và minh chứng</w:t>
+            </w:r>
+          </w:p>
+        </w:tc>
+        <w:tc>
+          <w:tcPr>
+            <w:tcW w:w="3900" w:type="dxa"/>
+            <w:shd w:val="clear" w:color="auto" w:fill="DCEAF4"/>
+          </w:tcPr>
+          <w:p>
+            <w:pPr>
+              <w:spacing w:after="0" w:line="360" w:lineRule="auto"/>
+              <w:rPr>
+                <w:rFonts w:ascii="Times New Roman" w:hAnsi="Times New Roman" w:cs="Times New Roman"/>
+                <w:b/>
+                <w:sz w:val="19"/>
+                <w:szCs w:val="26"/>
+              </w:rPr>
+            </w:pPr>
+            <w:r>
+              <w:rPr>
+                <w:rFonts w:ascii="Times New Roman" w:hAnsi="Times New Roman" w:cs="Times New Roman"/>
+                <w:b/>
+                <w:sz w:val="19"/>
+                <w:szCs w:val="26"/>
+              </w:rPr>
+              <w:t>Chưa làm hoặc chưa có minh chứng</w:t>
+            </w:r>
+          </w:p>
+        </w:tc>
+      </w:tr>
+      <w:tr>
+        <w:trPr>
+          <w:cantSplit/>
+        </w:trPr>
+        <w:tc>
+          <w:tcPr>
+            <w:tcW w:w="2700" w:type="dxa"/>
+          </w:tcPr>
+          <w:p>
+            <w:pPr>
+              <w:spacing w:after="0" w:line="360" w:lineRule="auto"/>
+              <w:rPr>
+                <w:rFonts w:ascii="Times New Roman" w:hAnsi="Times New Roman" w:cs="Times New Roman"/>
+                <w:sz w:val="19"/>
+                <w:szCs w:val="26"/>
+              </w:rPr>
+            </w:pPr>
+            <w:r>
+              <w:rPr>
+                <w:rFonts w:ascii="Times New Roman" w:hAnsi="Times New Roman" w:cs="Times New Roman"/>
+                <w:sz w:val="19"/>
+                <w:szCs w:val="26"/>
+              </w:rPr>
+              <w:t>Backlog và phân công</w:t>
+            </w:r>
+          </w:p>
+        </w:tc>
+        <w:tc>
+          <w:tcPr>
+            <w:tcW w:w="4100" w:type="dxa"/>
+          </w:tcPr>
+          <w:p>
+            <w:pPr>
+              <w:spacing w:after="0" w:line="360" w:lineRule="auto"/>
+              <w:rPr>
+                <w:rFonts w:ascii="Times New Roman" w:hAnsi="Times New Roman" w:cs="Times New Roman"/>
+                <w:sz w:val="19"/>
+                <w:szCs w:val="26"/>
+              </w:rPr>
+            </w:pPr>
+            <w:r>
+              <w:rPr>
+                <w:rFonts w:ascii="Times New Roman" w:hAnsi="Times New Roman" w:cs="Times New Roman"/>
+                <w:sz w:val="19"/>
+                <w:szCs w:val="26"/>
+              </w:rPr>
+              <w:t>Nhóm cung cấp 10 story, 37 SP và người phụ trách; xem sprint-1.md.</w:t>
+            </w:r>
+          </w:p>
+        </w:tc>
+        <w:tc>
+          <w:tcPr>
+            <w:tcW w:w="3900" w:type="dxa"/>
+          </w:tcPr>
+          <w:p>
+            <w:pPr>
+              <w:spacing w:after="0" w:line="360" w:lineRule="auto"/>
+              <w:rPr>
+                <w:rFonts w:ascii="Times New Roman" w:hAnsi="Times New Roman" w:cs="Times New Roman"/>
+                <w:sz w:val="19"/>
+                <w:szCs w:val="26"/>
+              </w:rPr>
+            </w:pPr>
+            <w:r>
+              <w:rPr>
+                <w:rFonts w:ascii="Times New Roman" w:hAnsi="Times New Roman" w:cs="Times New Roman"/>
+                <w:sz w:val="19"/>
+                <w:szCs w:val="26"/>
+              </w:rPr>
+              <w:t>Chín ngày bắt đầu thực tế sai năm; Done tại 27/09 chưa xác nhận.</w:t>
+            </w:r>
+          </w:p>
+        </w:tc>
+      </w:tr>
+      <w:tr>
+        <w:trPr>
+          <w:cantSplit/>
+        </w:trPr>
+        <w:tc>
+          <w:tcPr>
+            <w:tcW w:w="2700" w:type="dxa"/>
+          </w:tcPr>
+          <w:p>
+            <w:pPr>
+              <w:spacing w:after="0" w:line="360" w:lineRule="auto"/>
+              <w:rPr>
+                <w:rFonts w:ascii="Times New Roman" w:hAnsi="Times New Roman" w:cs="Times New Roman"/>
+                <w:sz w:val="19"/>
+                <w:szCs w:val="26"/>
+              </w:rPr>
+            </w:pPr>
+            <w:r>
+              <w:rPr>
+                <w:rFonts w:ascii="Times New Roman" w:hAnsi="Times New Roman" w:cs="Times New Roman"/>
+                <w:sz w:val="19"/>
+                <w:szCs w:val="26"/>
+              </w:rPr>
+              <w:t>Mã nguồn và demo</w:t>
+            </w:r>
+          </w:p>
+        </w:tc>
+        <w:tc>
+          <w:tcPr>
+            <w:tcW w:w="4100" w:type="dxa"/>
+          </w:tcPr>
+          <w:p>
+            <w:pPr>
+              <w:spacing w:after="0" w:line="360" w:lineRule="auto"/>
+              <w:rPr>
+                <w:rFonts w:ascii="Times New Roman" w:hAnsi="Times New Roman" w:cs="Times New Roman"/>
+                <w:sz w:val="19"/>
+                <w:szCs w:val="26"/>
+              </w:rPr>
+            </w:pPr>
+            <w:r>
+              <w:rPr>
+                <w:rFonts w:ascii="Times New Roman" w:hAnsi="Times New Roman" w:cs="Times New Roman"/>
+                <w:sz w:val="19"/>
+                <w:szCs w:val="26"/>
+              </w:rPr>
+              <w:t>Catalog, tài khoản, giỏ, COD, đơn có mã; 22 browser smoke pass.</w:t>
+            </w:r>
+          </w:p>
+        </w:tc>
+        <w:tc>
+          <w:tcPr>
+            <w:tcW w:w="3900" w:type="dxa"/>
+          </w:tcPr>
+          <w:p>
+            <w:pPr>
+              <w:spacing w:after="0" w:line="360" w:lineRule="auto"/>
+              <w:rPr>
+                <w:rFonts w:ascii="Times New Roman" w:hAnsi="Times New Roman" w:cs="Times New Roman"/>
+                <w:sz w:val="19"/>
+                <w:szCs w:val="26"/>
+              </w:rPr>
+            </w:pPr>
+            <w:r>
+              <w:rPr>
+                <w:rFonts w:ascii="Times New Roman" w:hAnsi="Times New Roman" w:cs="Times New Roman"/>
+                <w:sz w:val="19"/>
+                <w:szCs w:val="26"/>
+              </w:rPr>
+              <w:t>Chưa có biên bản demo/nghiệm thu tại cuối Sprint 1.</w:t>
+            </w:r>
+          </w:p>
+        </w:tc>
+      </w:tr>
+      <w:tr>
+        <w:trPr>
+          <w:cantSplit/>
+        </w:trPr>
+        <w:tc>
+          <w:tcPr>
+            <w:tcW w:w="2700" w:type="dxa"/>
+          </w:tcPr>
+          <w:p>
+            <w:pPr>
+              <w:spacing w:after="0" w:line="360" w:lineRule="auto"/>
+              <w:rPr>
+                <w:rFonts w:ascii="Times New Roman" w:hAnsi="Times New Roman" w:cs="Times New Roman"/>
+                <w:sz w:val="19"/>
+                <w:szCs w:val="26"/>
+              </w:rPr>
+            </w:pPr>
+            <w:r>
+              <w:rPr>
+                <w:rFonts w:ascii="Times New Roman" w:hAnsi="Times New Roman" w:cs="Times New Roman"/>
+                <w:sz w:val="19"/>
+                <w:szCs w:val="26"/>
+              </w:rPr>
+              <w:t>Kiểm thử</w:t>
+            </w:r>
+          </w:p>
+        </w:tc>
+        <w:tc>
+          <w:tcPr>
+            <w:tcW w:w="4100" w:type="dxa"/>
+          </w:tcPr>
+          <w:p>
+            <w:pPr>
+              <w:spacing w:after="0" w:line="360" w:lineRule="auto"/>
+              <w:rPr>
+                <w:rFonts w:ascii="Times New Roman" w:hAnsi="Times New Roman" w:cs="Times New Roman"/>
+                <w:sz w:val="19"/>
+                <w:szCs w:val="26"/>
+              </w:rPr>
+            </w:pPr>
+            <w:r>
+              <w:rPr>
+                <w:rFonts w:ascii="Times New Roman" w:hAnsi="Times New Roman" w:cs="Times New Roman"/>
+                <w:sz w:val="19"/>
+                <w:szCs w:val="26"/>
+              </w:rPr>
+              <w:t>110 backend + 22 browser pass ngày 14/10; có ca hợp lệ và biên.</w:t>
+            </w:r>
+          </w:p>
+        </w:tc>
+        <w:tc>
+          <w:tcPr>
+            <w:tcW w:w="3900" w:type="dxa"/>
+          </w:tcPr>
+          <w:p>
+            <w:pPr>
+              <w:spacing w:after="0" w:line="360" w:lineRule="auto"/>
+              <w:rPr>
+                <w:rFonts w:ascii="Times New Roman" w:hAnsi="Times New Roman" w:cs="Times New Roman"/>
+                <w:sz w:val="19"/>
+                <w:szCs w:val="26"/>
+              </w:rPr>
+            </w:pPr>
+            <w:r>
+              <w:rPr>
+                <w:rFonts w:ascii="Times New Roman" w:hAnsi="Times New Roman" w:cs="Times New Roman"/>
+                <w:sz w:val="19"/>
+                <w:szCs w:val="26"/>
+              </w:rPr>
+              <w:t>Chưa có test report tại 27/09 hoặc bằng chứng demo thủ công.</w:t>
+            </w:r>
+          </w:p>
+        </w:tc>
+      </w:tr>
+      <w:tr>
+        <w:trPr>
+          <w:cantSplit/>
+        </w:trPr>
+        <w:tc>
+          <w:tcPr>
+            <w:tcW w:w="2700" w:type="dxa"/>
+          </w:tcPr>
+          <w:p>
+            <w:pPr>
+              <w:spacing w:after="0" w:line="360" w:lineRule="auto"/>
+              <w:rPr>
+                <w:rFonts w:ascii="Times New Roman" w:hAnsi="Times New Roman" w:cs="Times New Roman"/>
+                <w:sz w:val="19"/>
+                <w:szCs w:val="26"/>
+              </w:rPr>
+            </w:pPr>
+            <w:r>
+              <w:rPr>
+                <w:rFonts w:ascii="Times New Roman" w:hAnsi="Times New Roman" w:cs="Times New Roman"/>
+                <w:sz w:val="19"/>
+                <w:szCs w:val="26"/>
+              </w:rPr>
+              <w:t>GitHub</w:t>
+            </w:r>
+          </w:p>
+        </w:tc>
+        <w:tc>
+          <w:tcPr>
+            <w:tcW w:w="4100" w:type="dxa"/>
+          </w:tcPr>
+          <w:p>
+            <w:pPr>
+              <w:spacing w:after="0" w:line="360" w:lineRule="auto"/>
+              <w:rPr>
+                <w:rFonts w:ascii="Times New Roman" w:hAnsi="Times New Roman" w:cs="Times New Roman"/>
+                <w:sz w:val="19"/>
+                <w:szCs w:val="26"/>
+              </w:rPr>
+            </w:pPr>
+            <w:r>
+              <w:rPr>
+                <w:rFonts w:ascii="Times New Roman" w:hAnsi="Times New Roman" w:cs="Times New Roman"/>
+                <w:sz w:val="19"/>
+                <w:szCs w:val="26"/>
+              </w:rPr>
+              <w:t>Commit tổng hợp 307db31; PR #1 bổ sung test sau Sprint.</w:t>
+            </w:r>
+          </w:p>
+        </w:tc>
+        <w:tc>
+          <w:tcPr>
+            <w:tcW w:w="3900" w:type="dxa"/>
+          </w:tcPr>
+          <w:p>
+            <w:pPr>
+              <w:spacing w:after="0" w:line="360" w:lineRule="auto"/>
+              <w:rPr>
+                <w:rFonts w:ascii="Times New Roman" w:hAnsi="Times New Roman" w:cs="Times New Roman"/>
+                <w:sz w:val="19"/>
+                <w:szCs w:val="26"/>
+              </w:rPr>
+            </w:pPr>
+            <w:r>
+              <w:rPr>
+                <w:rFonts w:ascii="Times New Roman" w:hAnsi="Times New Roman" w:cs="Times New Roman"/>
+                <w:sz w:val="19"/>
+                <w:szCs w:val="26"/>
+              </w:rPr>
+              <w:t>Chưa có Issue, branch, PR và review riêng cho từng story.</w:t>
+            </w:r>
+          </w:p>
+        </w:tc>
+      </w:tr>
+      <w:tr>
+        <w:trPr>
+          <w:cantSplit/>
+        </w:trPr>
+        <w:tc>
+          <w:tcPr>
+            <w:tcW w:w="2700" w:type="dxa"/>
+          </w:tcPr>
+          <w:p>
+            <w:pPr>
+              <w:spacing w:after="0" w:line="360" w:lineRule="auto"/>
+              <w:rPr>
+                <w:rFonts w:ascii="Times New Roman" w:hAnsi="Times New Roman" w:cs="Times New Roman"/>
+                <w:sz w:val="19"/>
+                <w:szCs w:val="26"/>
+              </w:rPr>
+            </w:pPr>
+            <w:r>
+              <w:rPr>
+                <w:rFonts w:ascii="Times New Roman" w:hAnsi="Times New Roman" w:cs="Times New Roman"/>
+                <w:sz w:val="19"/>
+                <w:szCs w:val="26"/>
+              </w:rPr>
+              <w:t>Báo cáo và lỗi</w:t>
+            </w:r>
+          </w:p>
+        </w:tc>
+        <w:tc>
+          <w:tcPr>
+            <w:tcW w:w="4100" w:type="dxa"/>
+          </w:tcPr>
+          <w:p>
+            <w:pPr>
+              <w:spacing w:after="0" w:line="360" w:lineRule="auto"/>
+              <w:rPr>
+                <w:rFonts w:ascii="Times New Roman" w:hAnsi="Times New Roman" w:cs="Times New Roman"/>
+                <w:sz w:val="19"/>
+                <w:szCs w:val="26"/>
+              </w:rPr>
+            </w:pPr>
+            <w:r>
+              <w:rPr>
+                <w:rFonts w:ascii="Times New Roman" w:hAnsi="Times New Roman" w:cs="Times New Roman"/>
+                <w:sz w:val="19"/>
+                <w:szCs w:val="26"/>
+              </w:rPr>
+              <w:t>Có phiếu, sprint-1.md, demo.md; lần test không phát hiện bug mới.</w:t>
+            </w:r>
+          </w:p>
+        </w:tc>
+        <w:tc>
+          <w:tcPr>
+            <w:tcW w:w="3900" w:type="dxa"/>
+          </w:tcPr>
+          <w:p>
+            <w:pPr>
+              <w:spacing w:after="0" w:line="360" w:lineRule="auto"/>
+              <w:rPr>
+                <w:rFonts w:ascii="Times New Roman" w:hAnsi="Times New Roman" w:cs="Times New Roman"/>
+                <w:sz w:val="19"/>
+                <w:szCs w:val="26"/>
+              </w:rPr>
+            </w:pPr>
+            <w:r>
+              <w:rPr>
+                <w:rFonts w:ascii="Times New Roman" w:hAnsi="Times New Roman" w:cs="Times New Roman"/>
+                <w:sz w:val="19"/>
+                <w:szCs w:val="26"/>
+              </w:rPr>
+              <w:t>Chưa có biên bản Review/Retro; không có bug thực tế kèm sửa và retest.</w:t>
+            </w:r>
+          </w:p>
+        </w:tc>
+      </w:tr>
+    </w:tbl>
+    <w:p>
+      <w:pPr>
+        <w:spacing w:line="360" w:lineRule="auto"/>
+        <w:rPr>
+          <w:rFonts w:ascii="Times New Roman" w:hAnsi="Times New Roman" w:cs="Times New Roman"/>
+          <w:sz w:val="22"/>
+          <w:szCs w:val="26"/>
+        </w:rPr>
+      </w:pPr>
     </w:p>
     <w:sectPr>
       <w:pgSz w:w="12240" w:h="15840"/>

</xml_diff>

<commit_message>
docs: align Lab 4 reports with project milestones
</commit_message>
<xml_diff>
--- a/docs/lab4/LAB4.1-Techvora.docx
+++ b/docs/lab4/LAB4.1-Techvora.docx
@@ -149,7 +149,7 @@
           <w:sz w:val="22"/>
           <w:szCs w:val="26"/>
         </w:rPr>
-        <w:t xml:space="preserve">Thành viên: </w:t>
+        <w:t>Thành viên: Nguyễn Trương Anh Tuấn; Trần Tấn Phát; Trương Đức Phú; Bùi Phạm Phong Phú</w:t>
       </w:r>
       <w:r>
         <w:rPr>
@@ -157,7 +157,6 @@
           <w:sz w:val="22"/>
           <w:szCs w:val="26"/>
         </w:rPr>
-        <w:t>Nguyễn Trương Anh Tuấn</w:t>
       </w:r>
     </w:p>
     <w:p>
@@ -574,7 +573,7 @@
                 <w:sz w:val="19"/>
                 <w:szCs w:val="26"/>
               </w:rPr>
-              <w:t>Có mã/test hiện tại</w:t>
+              <w:t>Done (mã/test hiện tại)</w:t>
             </w:r>
           </w:p>
         </w:tc>
@@ -714,7 +713,7 @@
                 <w:sz w:val="19"/>
                 <w:szCs w:val="26"/>
               </w:rPr>
-              <w:t>Có mã/test hiện tại</w:t>
+              <w:t>Done (mã/test hiện tại)</w:t>
             </w:r>
           </w:p>
         </w:tc>
@@ -854,7 +853,7 @@
                 <w:sz w:val="19"/>
                 <w:szCs w:val="26"/>
               </w:rPr>
-              <w:t>Có mã/test hiện tại</w:t>
+              <w:t>Done (mã/test hiện tại)</w:t>
             </w:r>
           </w:p>
         </w:tc>
@@ -994,7 +993,7 @@
                 <w:sz w:val="19"/>
                 <w:szCs w:val="26"/>
               </w:rPr>
-              <w:t>Có mã/test hiện tại</w:t>
+              <w:t>Done (mã/test hiện tại)</w:t>
             </w:r>
           </w:p>
         </w:tc>
@@ -1038,22 +1037,36 @@
         </w:rPr>
       </w:pPr>
       <w:r>
-        <w:rPr>
-          <w:rFonts w:ascii="Times New Roman" w:hAnsi="Times New Roman" w:cs="Times New Roman"/>
-          <w:sz w:val="22"/>
-          <w:szCs w:val="26"/>
-        </w:rPr>
-        <w:t xml:space="preserve">Link GitHub Project / Issues: </w:t>
+        <w:t xml:space="preserve">Bảng tiến độ: </w:t>
       </w:r>
-      <w:hyperlink r:id="rId6" w:history="1">
+      <w:hyperlink r:id="rId9">
         <w:r>
           <w:rPr>
             <w:rStyle w:val="Hyperlink"/>
-            <w:rFonts w:ascii="Times New Roman" w:hAnsi="Times New Roman" w:cs="Times New Roman"/>
-            <w:sz w:val="22"/>
-            <w:szCs w:val="26"/>
           </w:rPr>
-          <w:t>https://github.com/Anhtuan2005/cnpm</w:t>
+          <w:t>GitHub Project</w:t>
+        </w:r>
+      </w:hyperlink>
+      <w:r>
+        <w:t xml:space="preserve">  |  Milestone: </w:t>
+      </w:r>
+      <w:hyperlink r:id="rId10">
+        <w:r>
+          <w:rPr>
+            <w:rStyle w:val="Hyperlink"/>
+          </w:rPr>
+          <w:t>Sprint 1</w:t>
+        </w:r>
+      </w:hyperlink>
+      <w:r>
+        <w:t xml:space="preserve">  |  Repository: </w:t>
+      </w:r>
+      <w:hyperlink r:id="rId6">
+        <w:r>
+          <w:rPr>
+            <w:rStyle w:val="Hyperlink"/>
+          </w:rPr>
+          <w:t>cnpm</w:t>
         </w:r>
       </w:hyperlink>
     </w:p>
@@ -1090,10 +1103,20 @@
       <w:r>
         <w:rPr>
           <w:rFonts w:ascii="Segoe UI Symbol" w:hAnsi="Segoe UI Symbol" w:cs="Segoe UI Symbol"/>
+          <w:b/>
           <w:sz w:val="22"/>
           <w:szCs w:val="26"/>
         </w:rPr>
-        <w:t>☐</w:t>
+        <w:t>☑</w:t>
+      </w:r>
+      <w:r>
+        <w:rPr>
+          <w:rFonts w:ascii="Segoe UI Symbol" w:hAnsi="Segoe UI Symbol" w:cs="Segoe UI Symbol"/>
+          <w:b/>
+          <w:sz w:val="22"/>
+          <w:szCs w:val="26"/>
+        </w:rPr>
+        <w:t xml:space="preserve"> </w:t>
       </w:r>
       <w:r>
         <w:rPr>
@@ -1101,7 +1124,7 @@
           <w:sz w:val="22"/>
           <w:szCs w:val="26"/>
         </w:rPr>
-        <w:t xml:space="preserve"> Tạo Issue/task tương ứng với từng User Story hoặc công việc.</w:t>
+        <w:t>Tạo Issue/task tương ứng với từng User Story hoặc công việc.</w:t>
       </w:r>
     </w:p>
     <w:p>
@@ -1116,6 +1139,7 @@
       <w:r>
         <w:rPr>
           <w:rFonts w:ascii="Segoe UI Symbol" w:hAnsi="Segoe UI Symbol" w:cs="Segoe UI Symbol"/>
+          <w:b/>
           <w:sz w:val="22"/>
           <w:szCs w:val="26"/>
         </w:rPr>
@@ -1123,11 +1147,20 @@
       </w:r>
       <w:r>
         <w:rPr>
+          <w:rFonts w:ascii="Segoe UI Symbol" w:hAnsi="Segoe UI Symbol" w:cs="Segoe UI Symbol"/>
+          <w:b/>
+          <w:sz w:val="22"/>
+          <w:szCs w:val="26"/>
+        </w:rPr>
+        <w:t xml:space="preserve"> </w:t>
+      </w:r>
+      <w:r>
+        <w:rPr>
           <w:rFonts w:ascii="Times New Roman" w:hAnsi="Times New Roman" w:cs="Times New Roman"/>
           <w:sz w:val="22"/>
           <w:szCs w:val="26"/>
         </w:rPr>
-        <w:t xml:space="preserve"> Mỗi thành viên tạo branch riêng (ví dụ: feature/login, feature/event-list).</w:t>
+        <w:t>Mỗi thành viên tạo branch riêng (ví dụ: feature/login, feature/event-list).</w:t>
       </w:r>
     </w:p>
     <w:p>
@@ -1142,11 +1175,20 @@
       <w:r>
         <w:rPr>
           <w:rFonts w:ascii="Segoe UI Symbol" w:hAnsi="Segoe UI Symbol" w:cs="Segoe UI Symbol"/>
+          <w:b/>
           <w:sz w:val="22"/>
           <w:szCs w:val="26"/>
         </w:rPr>
-        <w:lastRenderedPageBreak/>
         <w:t>☐</w:t>
+      </w:r>
+      <w:r>
+        <w:rPr>
+          <w:rFonts w:ascii="Segoe UI Symbol" w:hAnsi="Segoe UI Symbol" w:cs="Segoe UI Symbol"/>
+          <w:b/>
+          <w:sz w:val="22"/>
+          <w:szCs w:val="26"/>
+        </w:rPr>
+        <w:t xml:space="preserve"> </w:t>
       </w:r>
       <w:r>
         <w:rPr>
@@ -1154,7 +1196,7 @@
           <w:sz w:val="22"/>
           <w:szCs w:val="26"/>
         </w:rPr>
-        <w:t xml:space="preserve"> Commit thay đổi có ý nghĩa; tạo Pull Request (PR) và nhờ thành viên khác review.</w:t>
+        <w:t>Commit thay đổi có ý nghĩa; tạo Pull Request (PR) và nhờ thành viên khác review.</w:t>
       </w:r>
     </w:p>
     <w:p>
@@ -1169,6 +1211,7 @@
       <w:r>
         <w:rPr>
           <w:rFonts w:ascii="Segoe UI Symbol" w:hAnsi="Segoe UI Symbol" w:cs="Segoe UI Symbol"/>
+          <w:b/>
           <w:sz w:val="22"/>
           <w:szCs w:val="26"/>
         </w:rPr>
@@ -1176,11 +1219,20 @@
       </w:r>
       <w:r>
         <w:rPr>
+          <w:rFonts w:ascii="Segoe UI Symbol" w:hAnsi="Segoe UI Symbol" w:cs="Segoe UI Symbol"/>
+          <w:b/>
+          <w:sz w:val="22"/>
+          <w:szCs w:val="26"/>
+        </w:rPr>
+        <w:t xml:space="preserve"> </w:t>
+      </w:r>
+      <w:r>
+        <w:rPr>
           <w:rFonts w:ascii="Times New Roman" w:hAnsi="Times New Roman" w:cs="Times New Roman"/>
           <w:sz w:val="22"/>
           <w:szCs w:val="26"/>
         </w:rPr>
-        <w:t xml:space="preserve"> Chỉ merge thay đổi phù hợp, đã được kiểm tra; cập nhật trạng thái Issue/task.</w:t>
+        <w:t>Chỉ merge thay đổi phù hợp, đã được kiểm tra; cập nhật trạng thái Issue/task.</w:t>
       </w:r>
     </w:p>
     <w:tbl>
@@ -1224,6 +1276,7 @@
                 <w:sz w:val="19"/>
                 <w:szCs w:val="26"/>
               </w:rPr>
+              <w:lastRenderedPageBreak/>
               <w:t>Thành viên</w:t>
             </w:r>
           </w:p>
@@ -3000,7 +3053,6 @@
           <w:sz w:val="24"/>
           <w:szCs w:val="26"/>
         </w:rPr>
-        <w:lastRenderedPageBreak/>
         <w:t>5. Công việc riêng của Sprint</w:t>
       </w:r>
     </w:p>
@@ -3095,6 +3147,7 @@
           <w:sz w:val="24"/>
           <w:szCs w:val="26"/>
         </w:rPr>
+        <w:lastRenderedPageBreak/>
         <w:t>6. Nhật ký tiến độ và minh chứng</w:t>
       </w:r>
     </w:p>
@@ -3401,7 +3454,7 @@
                 <w:sz w:val="19"/>
                 <w:szCs w:val="26"/>
               </w:rPr>
-              <w:t>Báo cáo sprint-1.md</w:t>
+              <w:t>GitHub Project; docs/lab4/sprint-1.md</w:t>
             </w:r>
           </w:p>
         </w:tc>
@@ -3549,7 +3602,7 @@
                 <w:sz w:val="19"/>
                 <w:szCs w:val="26"/>
               </w:rPr>
-              <w:t>Mã hiện tại demo được; nghiệm thu tại 27/09 chưa xác nhận</w:t>
+              <w:t>10/10 Issue Sprint 1 đã đóng; mã/test hiện tại có thể demo. Nghiệm thu tại 27/09 chưa xác nhận.</w:t>
             </w:r>
           </w:p>
         </w:tc>
@@ -3597,7 +3650,7 @@
                 <w:sz w:val="19"/>
                 <w:szCs w:val="26"/>
               </w:rPr>
-              <w:t>10/10 có mã/test hiện tại; Done lịch sử cần nhóm xác nhận</w:t>
+              <w:t>10/10 Done trên Project theo mã/test ngày 14/10; chưa xác nhận nghiệm thu lịch sử.</w:t>
             </w:r>
           </w:p>
         </w:tc>
@@ -3838,10 +3891,20 @@
       <w:r>
         <w:rPr>
           <w:rFonts w:ascii="Segoe UI Symbol" w:hAnsi="Segoe UI Symbol" w:cs="Segoe UI Symbol"/>
+          <w:b/>
           <w:sz w:val="22"/>
           <w:szCs w:val="26"/>
         </w:rPr>
-        <w:t>☐</w:t>
+        <w:t>☑</w:t>
+      </w:r>
+      <w:r>
+        <w:rPr>
+          <w:rFonts w:ascii="Segoe UI Symbol" w:hAnsi="Segoe UI Symbol" w:cs="Segoe UI Symbol"/>
+          <w:b/>
+          <w:sz w:val="22"/>
+          <w:szCs w:val="26"/>
+        </w:rPr>
+        <w:t xml:space="preserve"> </w:t>
       </w:r>
       <w:r>
         <w:rPr>
@@ -3849,7 +3912,7 @@
           <w:sz w:val="22"/>
           <w:szCs w:val="26"/>
         </w:rPr>
-        <w:t xml:space="preserve"> Phiếu thực hành LAB 4 đã điền đầy đủ.</w:t>
+        <w:t>Phiếu thực hành LAB 4 đã điền đầy đủ.</w:t>
       </w:r>
     </w:p>
     <w:p>
@@ -3864,10 +3927,20 @@
       <w:r>
         <w:rPr>
           <w:rFonts w:ascii="Segoe UI Symbol" w:hAnsi="Segoe UI Symbol" w:cs="Segoe UI Symbol"/>
+          <w:b/>
           <w:sz w:val="22"/>
           <w:szCs w:val="26"/>
         </w:rPr>
-        <w:t>☐</w:t>
+        <w:t>☑</w:t>
+      </w:r>
+      <w:r>
+        <w:rPr>
+          <w:rFonts w:ascii="Segoe UI Symbol" w:hAnsi="Segoe UI Symbol" w:cs="Segoe UI Symbol"/>
+          <w:b/>
+          <w:sz w:val="22"/>
+          <w:szCs w:val="26"/>
+        </w:rPr>
+        <w:t xml:space="preserve"> </w:t>
       </w:r>
       <w:r>
         <w:rPr>
@@ -3875,7 +3948,7 @@
           <w:sz w:val="22"/>
           <w:szCs w:val="26"/>
         </w:rPr>
-        <w:t xml:space="preserve"> Link GitHub repository và bảng Issue/Project (Sprint Backlog).</w:t>
+        <w:t>Link GitHub repository và bảng Issue/Project (Sprint Backlog).</w:t>
       </w:r>
     </w:p>
     <w:p>
@@ -3890,6 +3963,7 @@
       <w:r>
         <w:rPr>
           <w:rFonts w:ascii="Segoe UI Symbol" w:hAnsi="Segoe UI Symbol" w:cs="Segoe UI Symbol"/>
+          <w:b/>
           <w:sz w:val="22"/>
           <w:szCs w:val="26"/>
         </w:rPr>
@@ -3897,11 +3971,20 @@
       </w:r>
       <w:r>
         <w:rPr>
+          <w:rFonts w:ascii="Segoe UI Symbol" w:hAnsi="Segoe UI Symbol" w:cs="Segoe UI Symbol"/>
+          <w:b/>
+          <w:sz w:val="22"/>
+          <w:szCs w:val="26"/>
+        </w:rPr>
+        <w:t xml:space="preserve"> </w:t>
+      </w:r>
+      <w:r>
+        <w:rPr>
           <w:rFonts w:ascii="Times New Roman" w:hAnsi="Times New Roman" w:cs="Times New Roman"/>
           <w:sz w:val="22"/>
           <w:szCs w:val="26"/>
         </w:rPr>
-        <w:t xml:space="preserve"> Source code/bản chạy được; lịch sử branch, commit, Pull Request, review/merge.</w:t>
+        <w:t>Source code/bản chạy được; lịch sử branch, commit, Pull Request, review/merge.</w:t>
       </w:r>
     </w:p>
     <w:p>
@@ -3916,6 +3999,7 @@
       <w:r>
         <w:rPr>
           <w:rFonts w:ascii="Segoe UI Symbol" w:hAnsi="Segoe UI Symbol" w:cs="Segoe UI Symbol"/>
+          <w:b/>
           <w:sz w:val="22"/>
           <w:szCs w:val="26"/>
         </w:rPr>
@@ -3923,11 +4007,20 @@
       </w:r>
       <w:r>
         <w:rPr>
+          <w:rFonts w:ascii="Segoe UI Symbol" w:hAnsi="Segoe UI Symbol" w:cs="Segoe UI Symbol"/>
+          <w:b/>
+          <w:sz w:val="22"/>
+          <w:szCs w:val="26"/>
+        </w:rPr>
+        <w:t xml:space="preserve"> </w:t>
+      </w:r>
+      <w:r>
+        <w:rPr>
           <w:rFonts w:ascii="Times New Roman" w:hAnsi="Times New Roman" w:cs="Times New Roman"/>
           <w:sz w:val="22"/>
           <w:szCs w:val="26"/>
         </w:rPr>
-        <w:t xml:space="preserve"> Test cases, Bug Report/Issues, minh chứng sửa lỗi và kiểm thử lại.</w:t>
+        <w:t>Test cases, Bug Report/Issues, minh chứng sửa lỗi và kiểm thử lại.</w:t>
       </w:r>
     </w:p>
     <w:p>
@@ -3942,10 +4035,20 @@
       <w:r>
         <w:rPr>
           <w:rFonts w:ascii="Segoe UI Symbol" w:hAnsi="Segoe UI Symbol" w:cs="Segoe UI Symbol"/>
+          <w:b/>
           <w:sz w:val="22"/>
           <w:szCs w:val="26"/>
         </w:rPr>
-        <w:t>☐</w:t>
+        <w:t>☑</w:t>
+      </w:r>
+      <w:r>
+        <w:rPr>
+          <w:rFonts w:ascii="Segoe UI Symbol" w:hAnsi="Segoe UI Symbol" w:cs="Segoe UI Symbol"/>
+          <w:b/>
+          <w:sz w:val="22"/>
+          <w:szCs w:val="26"/>
+        </w:rPr>
+        <w:t xml:space="preserve"> </w:t>
       </w:r>
       <w:r>
         <w:rPr>
@@ -3953,7 +4056,7 @@
           <w:sz w:val="22"/>
           <w:szCs w:val="26"/>
         </w:rPr>
-        <w:t xml:space="preserve"> Tài liệu cập nhật và Sprint Report; bản demo/hướng dẫn chạy.</w:t>
+        <w:t>Tài liệu cập nhật và Sprint Report; bản demo/hướng dẫn chạy.</w:t>
       </w:r>
     </w:p>
     <w:p>
@@ -3989,7 +4092,7 @@
           <w:sz w:val="22"/>
           <w:szCs w:val="26"/>
         </w:rPr>
-        <w:t>Chi tiết: docs/lab4/sprint-1.md. Ngày bắt đầu thực tế ở chín dòng Sprint 1 cần đối chiếu lại; nhật ký trên là mốc Git/test, không phải biên bản họp.</w:t>
+        <w:t>Chi tiết: docs/lab4/sprint-1.md. Milestone Sprint 1 đã đóng 10/10 Issue; ngày bắt đầu thực tế ở chín dòng Sprint 1 cần đối chiếu. Nhật ký là mốc Git/test, không phải biên bản họp.</w:t>
       </w:r>
     </w:p>
     <w:sectPr>
@@ -4813,7 +4916,6 @@
   <w:style w:type="character" w:default="1" w:styleId="DefaultParagraphFont">
     <w:name w:val="Default Paragraph Font"/>
     <w:uiPriority w:val="1"/>
-    <w:semiHidden/>
     <w:unhideWhenUsed/>
   </w:style>
   <w:style w:type="table" w:default="1" w:styleId="TableNormal">

</xml_diff>

<commit_message>
docs: fill Sprint work sections in Lab 4 reports
</commit_message>
<xml_diff>
--- a/docs/lab4/LAB4.1-Techvora.docx
+++ b/docs/lab4/LAB4.1-Techvora.docx
@@ -3071,7 +3071,7 @@
           <w:sz w:val="22"/>
           <w:szCs w:val="26"/>
         </w:rPr>
-        <w:t>A. Đóng gói và chạy thử Sprint 1: ghi cách cài đặt/chạy; tạo bản demo hoặc bản triển khai nếu dự án cho phép.</w:t>
+        <w:t>A. Đóng gói: README có cách chạy local; chưa có URL triển khai.</w:t>
       </w:r>
     </w:p>
     <w:p>
@@ -3089,7 +3089,7 @@
           <w:sz w:val="22"/>
           <w:szCs w:val="26"/>
         </w:rPr>
-        <w:t>B. Cập nhật tài liệu: yêu cầu, thiết kế, hướng dẫn chạy, test report, trạng thái công việc.</w:t>
+        <w:t>B. Tài liệu: README, hướng dẫn demo, hồ sơ Sprint 1 và kết quả test đã cập nhật.</w:t>
       </w:r>
     </w:p>
     <w:p>
@@ -3107,7 +3107,7 @@
           <w:sz w:val="22"/>
           <w:szCs w:val="26"/>
         </w:rPr>
-        <w:t>C. Sprint Review: demo chức năng hoàn thành; chỉ ra Acceptance Criteria đã đạt/chưa đạt.</w:t>
+        <w:t>C. Sprint Review: chưa có biên bản; mã/test hiện tại đủ để demo.</w:t>
       </w:r>
     </w:p>
     <w:p>
@@ -3125,7 +3125,7 @@
           <w:sz w:val="22"/>
           <w:szCs w:val="26"/>
         </w:rPr>
-        <w:t>D. Retrospective: mỗi nhóm nêu ít nhất 1 điều làm tốt, 1 khó khăn và 1 cải tiến cho Sprint 2.</w:t>
+        <w:t>D. Retrospective: commit gộp và thiếu review; Sprint 2 cần tách Issue, branch, PR.</w:t>
       </w:r>
     </w:p>
     <w:p>

</xml_diff>